<commit_message>
WBP. Full function with count down at the end. Next version id and Count doun to start
</commit_message>
<xml_diff>
--- a/Pendiete_borrar.docx
+++ b/Pendiete_borrar.docx
@@ -12,15 +12,7 @@
     </w:p>
     <w:p>
       <w:r>
-        <w:t xml:space="preserve">Probar todos </w:t>
-      </w:r>
-      <w:proofErr w:type="spellStart"/>
-      <w:r>
-        <w:t>loe</w:t>
-      </w:r>
-      <w:proofErr w:type="spellEnd"/>
-      <w:r>
-        <w:t xml:space="preserve"> errores, </w:t>
+        <w:t xml:space="preserve">Probar todos loe errores, </w:t>
       </w:r>
     </w:p>
     <w:p>
@@ -31,104 +23,45 @@
         <w:t xml:space="preserve"> m</w:t>
       </w:r>
       <w:r>
-        <w:t xml:space="preserve">odo </w:t>
-      </w:r>
-      <w:proofErr w:type="spellStart"/>
-      <w:r>
-        <w:t>reco</w:t>
+        <w:t>odo reco</w:t>
       </w:r>
       <w:r>
         <w:t>v</w:t>
       </w:r>
       <w:r>
-        <w:t>ery</w:t>
-      </w:r>
-      <w:proofErr w:type="spellEnd"/>
-      <w:r>
-        <w:t xml:space="preserve"> </w:t>
+        <w:t xml:space="preserve">ery </w:t>
       </w:r>
     </w:p>
     <w:p>
       <w:r>
-        <w:t xml:space="preserve">Como incluir parada de </w:t>
-      </w:r>
-      <w:proofErr w:type="spellStart"/>
-      <w:r>
-        <w:t>confirmnación</w:t>
-      </w:r>
-      <w:proofErr w:type="spellEnd"/>
-      <w:r>
-        <w:t xml:space="preserve"> y muestra de versión a </w:t>
-      </w:r>
-      <w:proofErr w:type="spellStart"/>
-      <w:r>
-        <w:t>acargar</w:t>
-      </w:r>
-      <w:proofErr w:type="spellEnd"/>
-      <w:r>
-        <w:t xml:space="preserve"> ¿con confirmación</w:t>
-      </w:r>
-      <w:r>
-        <w:t xml:space="preserve"> </w:t>
-      </w:r>
-      <w:proofErr w:type="spellStart"/>
-      <w:r>
-        <w:t>touch</w:t>
-      </w:r>
-      <w:proofErr w:type="spellEnd"/>
+        <w:t>Como incluir parada de confirmnación y muestra de versión a acargar ¿con confirmación</w:t>
+      </w:r>
+      <w:r>
+        <w:t xml:space="preserve"> touch</w:t>
+      </w:r>
       <w:r>
         <w:t>?</w:t>
       </w:r>
       <w:r>
-        <w:t xml:space="preserve"> ¿con </w:t>
-      </w:r>
-      <w:proofErr w:type="spellStart"/>
-      <w:r>
-        <w:t>timeout</w:t>
-      </w:r>
-      <w:proofErr w:type="spellEnd"/>
-      <w:r>
-        <w:t>?</w:t>
+        <w:t xml:space="preserve"> ¿con timeout?</w:t>
       </w:r>
     </w:p>
     <w:p>
       <w:r>
-        <w:t xml:space="preserve">Incluir un </w:t>
-      </w:r>
-      <w:proofErr w:type="spellStart"/>
-      <w:r>
-        <w:t>acuante</w:t>
-      </w:r>
-      <w:proofErr w:type="spellEnd"/>
-      <w:r>
-        <w:t xml:space="preserve"> atrás para saltar a la </w:t>
-      </w:r>
-      <w:proofErr w:type="gramStart"/>
-      <w:r>
-        <w:t>app</w:t>
-      </w:r>
-      <w:proofErr w:type="gramEnd"/>
-      <w:r>
-        <w:t xml:space="preserve"> después del </w:t>
-      </w:r>
-      <w:proofErr w:type="spellStart"/>
-      <w:r>
-        <w:t>boot</w:t>
-      </w:r>
-      <w:proofErr w:type="spellEnd"/>
-      <w:r>
-        <w:t xml:space="preserve">, para que se </w:t>
-      </w:r>
-      <w:proofErr w:type="spellStart"/>
-      <w:r>
-        <w:t>pued</w:t>
-      </w:r>
-      <w:proofErr w:type="spellEnd"/>
-      <w:r>
-        <w:t xml:space="preserve"> leer el mensaje de OK</w:t>
+        <w:t>Incluir un acuante atrás para saltar a la app después del boot, para que se pued leer el mensaje de OK</w:t>
       </w:r>
     </w:p>
     <w:p/>
+    <w:p>
+      <w:r>
+        <w:t>FRASE UTIL PAR CONTINUAR</w:t>
+      </w:r>
+    </w:p>
+    <w:p>
+      <w:r>
+        <w:t xml:space="preserve">  - “Continuar sobre O3_Bootloader, manteniendo confirmación previa antes de editar, con cuenta atrás final de 30 s y while(1) final aún activo”.</w:t>
+      </w:r>
+    </w:p>
     <w:sectPr>
       <w:pgSz w:w="11906" w:h="16838"/>
       <w:pgMar w:top="1417" w:right="1701" w:bottom="1417" w:left="1701" w:header="708" w:footer="708" w:gutter="0"/>

</xml_diff>